<commit_message>
feat: merge police gesture into unified backend
</commit_message>
<xml_diff>
--- a/docs/交警手势识别gpu加速.docx
+++ b/docs/交警手势识别gpu加速.docx
@@ -1419,7 +1419,7 @@
           <w:color w:val="404040"/>
           <w:sz w:val="19"/>
         </w:rPr>
-        <w:t>python server.py</w:t>
+        <w:t>uvicorn app.main:app --host 0.0.0.0 --port 8000 --reload</w:t>
       </w:r>
     </w:p>
     <w:p/>
@@ -2684,7 +2684,7 @@
           <w:color w:val="404040"/>
           <w:sz w:val="19"/>
         </w:rPr>
-        <w:t>python server.py</w:t>
+        <w:t>uvicorn app.main:app --host 0.0.0.0 --port 8000 --reload</w:t>
       </w:r>
     </w:p>
     <w:p/>

</xml_diff>